<commit_message>
fix(conversion): pixel-perfect fonts, sizing, spacing, card table margins, multi-section architecture and large-document optimizations
</commit_message>
<xml_diff>
--- a/test-fixtures/output-user-salary-slip.docx
+++ b/test-fixtures/output-user-salary-slip.docx
@@ -15,8 +15,8 @@
         </w:tblBorders>
       </w:tblPr>
       <w:tblGrid>
-        <w:gridCol w:w="5233"/>
-        <w:gridCol w:w="5233"/>
+        <w:gridCol w:w="5413"/>
+        <w:gridCol w:w="5413"/>
       </w:tblGrid>
       <w:tr>
         <w:tc>
@@ -25,7 +25,7 @@
           </w:tcPr>
           <w:p>
             <w:pPr>
-              <w:spacing w:after="120" w:before="120"/>
+              <w:spacing w:after="140" w:before="140"/>
             </w:pPr>
             <w:r>
               <w:rPr>
@@ -45,15 +45,15 @@
             <w:tcW w:type="pct" w:w="2500"/>
             <w:shd w:fill="050066" w:color="auto" w:val="clear"/>
             <w:tcMar>
-              <w:top w:type="dxa" w:w="160"/>
-              <w:left w:type="dxa" w:w="200"/>
-              <w:bottom w:type="dxa" w:w="160"/>
-              <w:right w:type="dxa" w:w="200"/>
-            </w:tcMar>
-          </w:tcPr>
-          <w:p>
-            <w:pPr>
-              <w:spacing w:after="40"/>
+              <w:top w:type="dxa" w:w="200"/>
+              <w:left w:type="dxa" w:w="240"/>
+              <w:bottom w:type="dxa" w:w="200"/>
+              <w:right w:type="dxa" w:w="240"/>
+            </w:tcMar>
+          </w:tcPr>
+          <w:p>
+            <w:pPr>
+              <w:spacing w:after="30"/>
               <w:jc w:val="center"/>
             </w:pPr>
             <w:r>
@@ -62,25 +62,25 @@
                 <w:b/>
                 <w:bCs/>
                 <w:color w:val="FFFFFF"/>
-                <w:sz w:val="52"/>
-                <w:szCs w:val="52"/>
+                <w:sz w:val="72"/>
+                <w:szCs w:val="72"/>
               </w:rPr>
               <w:t xml:space="preserve">E-Solar</w:t>
             </w:r>
           </w:p>
           <w:p>
             <w:pPr>
-              <w:spacing w:after="40"/>
+              <w:spacing w:after="30"/>
               <w:jc w:val="center"/>
             </w:pPr>
             <w:r>
               <w:rPr>
                 <w:rFonts w:ascii="Georgia" w:cs="Georgia" w:eastAsia="Georgia" w:hAnsi="Georgia"/>
-                <w:b/>
-                <w:bCs/>
+                <w:b w:val="false"/>
+                <w:bCs w:val="false"/>
                 <w:color w:val="FFFFFF"/>
-                <w:sz w:val="36"/>
-                <w:szCs w:val="36"/>
+                <w:sz w:val="50"/>
+                <w:szCs w:val="50"/>
               </w:rPr>
               <w:t xml:space="preserve">Energies</w:t>
             </w:r>
@@ -90,12 +90,12 @@
     </w:tbl>
     <w:p>
       <w:pPr>
-        <w:spacing w:after="140"/>
+        <w:spacing w:after="160"/>
       </w:pPr>
     </w:p>
     <w:p>
       <w:pPr>
-        <w:spacing w:after="70" w:before="40" w:line="260"/>
+        <w:spacing w:after="80" w:before="180" w:line="300"/>
       </w:pPr>
       <w:r>
         <w:rPr>
@@ -103,11 +103,81 @@
           <w:b/>
           <w:bCs/>
           <w:color w:val="050066"/>
-          <w:sz w:val="24"/>
-          <w:szCs w:val="24"/>
+          <w:sz w:val="30"/>
+          <w:szCs w:val="30"/>
         </w:rPr>
         <w:t xml:space="preserve">Employee Name:</w:t>
       </w:r>
+      <w:r>
+        <w:rPr>
+          <w:rFonts w:ascii="Arial" w:cs="Arial" w:eastAsia="Arial" w:hAnsi="Arial"/>
+          <w:b w:val="false"/>
+          <w:bCs w:val="false"/>
+          <w:color w:val="050066"/>
+          <w:sz w:val="30"/>
+          <w:szCs w:val="30"/>
+        </w:rPr>
+        <w:t xml:space="preserve"> Hamza Alloudin</w:t>
+      </w:r>
+    </w:p>
+    <w:p>
+      <w:pPr>
+        <w:spacing w:after="80" w:before="40" w:line="300"/>
+      </w:pPr>
+      <w:r>
+        <w:rPr>
+          <w:rFonts w:ascii="Arial" w:cs="Arial" w:eastAsia="Arial" w:hAnsi="Arial"/>
+          <w:b/>
+          <w:bCs/>
+          <w:color w:val="050066"/>
+          <w:sz w:val="30"/>
+          <w:szCs w:val="30"/>
+        </w:rPr>
+        <w:t xml:space="preserve">Department:</w:t>
+      </w:r>
+      <w:r>
+        <w:rPr>
+          <w:rFonts w:ascii="Arial" w:cs="Arial" w:eastAsia="Arial" w:hAnsi="Arial"/>
+          <w:b w:val="false"/>
+          <w:bCs w:val="false"/>
+          <w:color w:val="050066"/>
+          <w:sz w:val="30"/>
+          <w:szCs w:val="30"/>
+        </w:rPr>
+        <w:t xml:space="preserve"> Sales and Marketing</w:t>
+      </w:r>
+    </w:p>
+    <w:p>
+      <w:pPr>
+        <w:spacing w:after="80" w:before="40" w:line="300"/>
+      </w:pPr>
+      <w:r>
+        <w:rPr>
+          <w:rFonts w:ascii="Arial" w:cs="Arial" w:eastAsia="Arial" w:hAnsi="Arial"/>
+          <w:b/>
+          <w:bCs/>
+          <w:color w:val="050066"/>
+          <w:sz w:val="30"/>
+          <w:szCs w:val="30"/>
+        </w:rPr>
+        <w:t xml:space="preserve">Designation:</w:t>
+      </w:r>
+      <w:r>
+        <w:rPr>
+          <w:rFonts w:ascii="Arial" w:cs="Arial" w:eastAsia="Arial" w:hAnsi="Arial"/>
+          <w:b w:val="false"/>
+          <w:bCs w:val="false"/>
+          <w:color w:val="050066"/>
+          <w:sz w:val="30"/>
+          <w:szCs w:val="30"/>
+        </w:rPr>
+        <w:t xml:space="preserve"> Sales Manager</w:t>
+      </w:r>
+    </w:p>
+    <w:p>
+      <w:pPr>
+        <w:spacing w:after="140" w:before="200" w:line="300"/>
+      </w:pPr>
       <w:r>
         <w:rPr>
           <w:rFonts w:ascii="Arial" w:cs="Arial" w:eastAsia="Arial" w:hAnsi="Arial"/>
@@ -116,76 +186,6 @@
           <w:color w:val="050066"/>
           <w:sz w:val="24"/>
           <w:szCs w:val="24"/>
-        </w:rPr>
-        <w:t xml:space="preserve"> Hamza Alloudin</w:t>
-      </w:r>
-    </w:p>
-    <w:p>
-      <w:pPr>
-        <w:spacing w:after="70" w:before="40" w:line="260"/>
-      </w:pPr>
-      <w:r>
-        <w:rPr>
-          <w:rFonts w:ascii="Arial" w:cs="Arial" w:eastAsia="Arial" w:hAnsi="Arial"/>
-          <w:b/>
-          <w:bCs/>
-          <w:color w:val="050066"/>
-          <w:sz w:val="24"/>
-          <w:szCs w:val="24"/>
-        </w:rPr>
-        <w:t xml:space="preserve">Department:</w:t>
-      </w:r>
-      <w:r>
-        <w:rPr>
-          <w:rFonts w:ascii="Arial" w:cs="Arial" w:eastAsia="Arial" w:hAnsi="Arial"/>
-          <w:b w:val="false"/>
-          <w:bCs w:val="false"/>
-          <w:color w:val="050066"/>
-          <w:sz w:val="24"/>
-          <w:szCs w:val="24"/>
-        </w:rPr>
-        <w:t xml:space="preserve"> Sales and Marketing</w:t>
-      </w:r>
-    </w:p>
-    <w:p>
-      <w:pPr>
-        <w:spacing w:after="70" w:before="40" w:line="260"/>
-      </w:pPr>
-      <w:r>
-        <w:rPr>
-          <w:rFonts w:ascii="Arial" w:cs="Arial" w:eastAsia="Arial" w:hAnsi="Arial"/>
-          <w:b/>
-          <w:bCs/>
-          <w:color w:val="050066"/>
-          <w:sz w:val="24"/>
-          <w:szCs w:val="24"/>
-        </w:rPr>
-        <w:t xml:space="preserve">Designation:</w:t>
-      </w:r>
-      <w:r>
-        <w:rPr>
-          <w:rFonts w:ascii="Arial" w:cs="Arial" w:eastAsia="Arial" w:hAnsi="Arial"/>
-          <w:b w:val="false"/>
-          <w:bCs w:val="false"/>
-          <w:color w:val="050066"/>
-          <w:sz w:val="24"/>
-          <w:szCs w:val="24"/>
-        </w:rPr>
-        <w:t xml:space="preserve"> Sales Manager</w:t>
-      </w:r>
-    </w:p>
-    <w:p>
-      <w:pPr>
-        <w:spacing w:after="140" w:before="180" w:line="260"/>
-      </w:pPr>
-      <w:r>
-        <w:rPr>
-          <w:rFonts w:ascii="Arial" w:cs="Arial" w:eastAsia="Arial" w:hAnsi="Arial"/>
-          <w:b w:val="false"/>
-          <w:bCs w:val="false"/>
-          <w:color w:val="050066"/>
-          <w:sz w:val="22"/>
-          <w:szCs w:val="22"/>
         </w:rPr>
         <w:t xml:space="preserve">Salary Slip for March, 2024</w:t>
       </w:r>
@@ -203,20 +203,20 @@
         </w:tblBorders>
       </w:tblPr>
       <w:tblGrid>
-        <w:gridCol w:w="4814"/>
-        <w:gridCol w:w="2826"/>
-        <w:gridCol w:w="2826"/>
+        <w:gridCol w:w="5196"/>
+        <w:gridCol w:w="2815"/>
+        <w:gridCol w:w="2815"/>
       </w:tblGrid>
       <w:tr>
         <w:tc>
           <w:tcPr>
-            <w:tcW w:type="pct" w:w="2300"/>
+            <w:tcW w:type="pct" w:w="2400"/>
             <w:shd w:fill="050066" w:color="auto" w:val="clear"/>
             <w:tcMar>
-              <w:top w:type="dxa" w:w="140"/>
-              <w:left w:type="dxa" w:w="160"/>
-              <w:bottom w:type="dxa" w:w="140"/>
-              <w:right w:type="dxa" w:w="160"/>
+              <w:top w:type="dxa" w:w="160"/>
+              <w:left w:type="dxa" w:w="180"/>
+              <w:bottom w:type="dxa" w:w="160"/>
+              <w:right w:type="dxa" w:w="180"/>
             </w:tcMar>
           </w:tcPr>
           <w:p>
@@ -238,13 +238,13 @@
         </w:tc>
         <w:tc>
           <w:tcPr>
-            <w:tcW w:type="pct" w:w="1350"/>
+            <w:tcW w:type="pct" w:w="1300"/>
             <w:shd w:fill="050066" w:color="auto" w:val="clear"/>
             <w:tcMar>
-              <w:top w:type="dxa" w:w="140"/>
-              <w:left w:type="dxa" w:w="160"/>
-              <w:bottom w:type="dxa" w:w="140"/>
-              <w:right w:type="dxa" w:w="160"/>
+              <w:top w:type="dxa" w:w="160"/>
+              <w:left w:type="dxa" w:w="180"/>
+              <w:bottom w:type="dxa" w:w="160"/>
+              <w:right w:type="dxa" w:w="180"/>
             </w:tcMar>
           </w:tcPr>
           <w:p>
@@ -266,13 +266,13 @@
         </w:tc>
         <w:tc>
           <w:tcPr>
-            <w:tcW w:type="pct" w:w="1350"/>
+            <w:tcW w:type="pct" w:w="1300"/>
             <w:shd w:fill="050066" w:color="auto" w:val="clear"/>
             <w:tcMar>
-              <w:top w:type="dxa" w:w="140"/>
-              <w:left w:type="dxa" w:w="160"/>
-              <w:bottom w:type="dxa" w:w="140"/>
-              <w:right w:type="dxa" w:w="160"/>
+              <w:top w:type="dxa" w:w="160"/>
+              <w:left w:type="dxa" w:w="180"/>
+              <w:bottom w:type="dxa" w:w="160"/>
+              <w:right w:type="dxa" w:w="180"/>
             </w:tcMar>
           </w:tcPr>
           <w:p>
@@ -296,13 +296,13 @@
       <w:tr>
         <w:tc>
           <w:tcPr>
-            <w:tcW w:type="pct" w:w="2300"/>
+            <w:tcW w:type="pct" w:w="2400"/>
             <w:shd w:fill="F6F6F6" w:color="auto" w:val="clear"/>
             <w:tcMar>
-              <w:top w:type="dxa" w:w="100"/>
-              <w:left w:type="dxa" w:w="160"/>
-              <w:bottom w:type="dxa" w:w="100"/>
-              <w:right w:type="dxa" w:w="160"/>
+              <w:top w:type="dxa" w:w="110"/>
+              <w:left w:type="dxa" w:w="180"/>
+              <w:bottom w:type="dxa" w:w="110"/>
+              <w:right w:type="dxa" w:w="180"/>
             </w:tcMar>
           </w:tcPr>
           <w:p>
@@ -315,8 +315,8 @@
                 <w:b w:val="false"/>
                 <w:bCs w:val="false"/>
                 <w:color w:val="050066"/>
-                <w:sz w:val="20"/>
-                <w:szCs w:val="20"/>
+                <w:sz w:val="24"/>
+                <w:szCs w:val="24"/>
               </w:rPr>
               <w:t xml:space="preserve">Basic Salary</w:t>
             </w:r>
@@ -324,13 +324,13 @@
         </w:tc>
         <w:tc>
           <w:tcPr>
-            <w:tcW w:type="pct" w:w="1350"/>
+            <w:tcW w:type="pct" w:w="1300"/>
             <w:shd w:fill="F6F6F6" w:color="auto" w:val="clear"/>
             <w:tcMar>
-              <w:top w:type="dxa" w:w="100"/>
-              <w:left w:type="dxa" w:w="160"/>
-              <w:bottom w:type="dxa" w:w="100"/>
-              <w:right w:type="dxa" w:w="160"/>
+              <w:top w:type="dxa" w:w="110"/>
+              <w:left w:type="dxa" w:w="180"/>
+              <w:bottom w:type="dxa" w:w="110"/>
+              <w:right w:type="dxa" w:w="180"/>
             </w:tcMar>
           </w:tcPr>
           <w:p>
@@ -343,8 +343,8 @@
                 <w:b w:val="false"/>
                 <w:bCs w:val="false"/>
                 <w:color w:val="050066"/>
-                <w:sz w:val="20"/>
-                <w:szCs w:val="20"/>
+                <w:sz w:val="24"/>
+                <w:szCs w:val="24"/>
               </w:rPr>
               <w:t xml:space="preserve">80,000/-</w:t>
             </w:r>
@@ -352,13 +352,13 @@
         </w:tc>
         <w:tc>
           <w:tcPr>
-            <w:tcW w:type="pct" w:w="1350"/>
+            <w:tcW w:type="pct" w:w="1300"/>
             <w:shd w:fill="F6F6F6" w:color="auto" w:val="clear"/>
             <w:tcMar>
-              <w:top w:type="dxa" w:w="100"/>
-              <w:left w:type="dxa" w:w="160"/>
-              <w:bottom w:type="dxa" w:w="100"/>
-              <w:right w:type="dxa" w:w="160"/>
+              <w:top w:type="dxa" w:w="110"/>
+              <w:left w:type="dxa" w:w="180"/>
+              <w:bottom w:type="dxa" w:w="110"/>
+              <w:right w:type="dxa" w:w="180"/>
             </w:tcMar>
           </w:tcPr>
           <w:p>
@@ -371,8 +371,8 @@
                 <w:b w:val="false"/>
                 <w:bCs w:val="false"/>
                 <w:color w:val="050066"/>
-                <w:sz w:val="20"/>
-                <w:szCs w:val="20"/>
+                <w:sz w:val="24"/>
+                <w:szCs w:val="24"/>
               </w:rPr>
               <w:t xml:space="preserve"/>
             </w:r>
@@ -382,13 +382,13 @@
       <w:tr>
         <w:tc>
           <w:tcPr>
-            <w:tcW w:type="pct" w:w="2300"/>
+            <w:tcW w:type="pct" w:w="2400"/>
             <w:shd w:fill="F6F6F6" w:color="auto" w:val="clear"/>
             <w:tcMar>
-              <w:top w:type="dxa" w:w="100"/>
-              <w:left w:type="dxa" w:w="160"/>
-              <w:bottom w:type="dxa" w:w="100"/>
-              <w:right w:type="dxa" w:w="160"/>
+              <w:top w:type="dxa" w:w="110"/>
+              <w:left w:type="dxa" w:w="180"/>
+              <w:bottom w:type="dxa" w:w="110"/>
+              <w:right w:type="dxa" w:w="180"/>
             </w:tcMar>
           </w:tcPr>
           <w:p>
@@ -401,8 +401,8 @@
                 <w:b w:val="false"/>
                 <w:bCs w:val="false"/>
                 <w:color w:val="050066"/>
-                <w:sz w:val="20"/>
-                <w:szCs w:val="20"/>
+                <w:sz w:val="24"/>
+                <w:szCs w:val="24"/>
               </w:rPr>
               <w:t xml:space="preserve">Overtime</w:t>
             </w:r>
@@ -410,13 +410,13 @@
         </w:tc>
         <w:tc>
           <w:tcPr>
-            <w:tcW w:type="pct" w:w="1350"/>
+            <w:tcW w:type="pct" w:w="1300"/>
             <w:shd w:fill="F6F6F6" w:color="auto" w:val="clear"/>
             <w:tcMar>
-              <w:top w:type="dxa" w:w="100"/>
-              <w:left w:type="dxa" w:w="160"/>
-              <w:bottom w:type="dxa" w:w="100"/>
-              <w:right w:type="dxa" w:w="160"/>
+              <w:top w:type="dxa" w:w="110"/>
+              <w:left w:type="dxa" w:w="180"/>
+              <w:bottom w:type="dxa" w:w="110"/>
+              <w:right w:type="dxa" w:w="180"/>
             </w:tcMar>
           </w:tcPr>
           <w:p>
@@ -429,8 +429,8 @@
                 <w:b w:val="false"/>
                 <w:bCs w:val="false"/>
                 <w:color w:val="050066"/>
-                <w:sz w:val="20"/>
-                <w:szCs w:val="20"/>
+                <w:sz w:val="24"/>
+                <w:szCs w:val="24"/>
               </w:rPr>
               <w:t xml:space="preserve">15,000/-</w:t>
             </w:r>
@@ -438,13 +438,13 @@
         </w:tc>
         <w:tc>
           <w:tcPr>
-            <w:tcW w:type="pct" w:w="1350"/>
+            <w:tcW w:type="pct" w:w="1300"/>
             <w:shd w:fill="F6F6F6" w:color="auto" w:val="clear"/>
             <w:tcMar>
-              <w:top w:type="dxa" w:w="100"/>
-              <w:left w:type="dxa" w:w="160"/>
-              <w:bottom w:type="dxa" w:w="100"/>
-              <w:right w:type="dxa" w:w="160"/>
+              <w:top w:type="dxa" w:w="110"/>
+              <w:left w:type="dxa" w:w="180"/>
+              <w:bottom w:type="dxa" w:w="110"/>
+              <w:right w:type="dxa" w:w="180"/>
             </w:tcMar>
           </w:tcPr>
           <w:p>
@@ -457,8 +457,8 @@
                 <w:b w:val="false"/>
                 <w:bCs w:val="false"/>
                 <w:color w:val="050066"/>
-                <w:sz w:val="20"/>
-                <w:szCs w:val="20"/>
+                <w:sz w:val="24"/>
+                <w:szCs w:val="24"/>
               </w:rPr>
               <w:t xml:space="preserve"/>
             </w:r>
@@ -468,13 +468,13 @@
       <w:tr>
         <w:tc>
           <w:tcPr>
-            <w:tcW w:type="pct" w:w="2300"/>
+            <w:tcW w:type="pct" w:w="2400"/>
             <w:shd w:fill="F6F6F6" w:color="auto" w:val="clear"/>
             <w:tcMar>
-              <w:top w:type="dxa" w:w="100"/>
-              <w:left w:type="dxa" w:w="160"/>
-              <w:bottom w:type="dxa" w:w="100"/>
-              <w:right w:type="dxa" w:w="160"/>
+              <w:top w:type="dxa" w:w="110"/>
+              <w:left w:type="dxa" w:w="180"/>
+              <w:bottom w:type="dxa" w:w="110"/>
+              <w:right w:type="dxa" w:w="180"/>
             </w:tcMar>
           </w:tcPr>
           <w:p>
@@ -487,8 +487,8 @@
                 <w:b w:val="false"/>
                 <w:bCs w:val="false"/>
                 <w:color w:val="050066"/>
-                <w:sz w:val="20"/>
-                <w:szCs w:val="20"/>
+                <w:sz w:val="24"/>
+                <w:szCs w:val="24"/>
               </w:rPr>
               <w:t xml:space="preserve">Gross Salary</w:t>
             </w:r>
@@ -496,13 +496,13 @@
         </w:tc>
         <w:tc>
           <w:tcPr>
-            <w:tcW w:type="pct" w:w="1350"/>
+            <w:tcW w:type="pct" w:w="1300"/>
             <w:shd w:fill="F6F6F6" w:color="auto" w:val="clear"/>
             <w:tcMar>
-              <w:top w:type="dxa" w:w="100"/>
-              <w:left w:type="dxa" w:w="160"/>
-              <w:bottom w:type="dxa" w:w="100"/>
-              <w:right w:type="dxa" w:w="160"/>
+              <w:top w:type="dxa" w:w="110"/>
+              <w:left w:type="dxa" w:w="180"/>
+              <w:bottom w:type="dxa" w:w="110"/>
+              <w:right w:type="dxa" w:w="180"/>
             </w:tcMar>
           </w:tcPr>
           <w:p>
@@ -515,8 +515,8 @@
                 <w:b w:val="false"/>
                 <w:bCs w:val="false"/>
                 <w:color w:val="050066"/>
-                <w:sz w:val="20"/>
-                <w:szCs w:val="20"/>
+                <w:sz w:val="24"/>
+                <w:szCs w:val="24"/>
               </w:rPr>
               <w:t xml:space="preserve">95,000/-</w:t>
             </w:r>
@@ -524,13 +524,13 @@
         </w:tc>
         <w:tc>
           <w:tcPr>
-            <w:tcW w:type="pct" w:w="1350"/>
+            <w:tcW w:type="pct" w:w="1300"/>
             <w:shd w:fill="F6F6F6" w:color="auto" w:val="clear"/>
             <w:tcMar>
-              <w:top w:type="dxa" w:w="100"/>
-              <w:left w:type="dxa" w:w="160"/>
-              <w:bottom w:type="dxa" w:w="100"/>
-              <w:right w:type="dxa" w:w="160"/>
+              <w:top w:type="dxa" w:w="110"/>
+              <w:left w:type="dxa" w:w="180"/>
+              <w:bottom w:type="dxa" w:w="110"/>
+              <w:right w:type="dxa" w:w="180"/>
             </w:tcMar>
           </w:tcPr>
           <w:p>
@@ -543,8 +543,8 @@
                 <w:b w:val="false"/>
                 <w:bCs w:val="false"/>
                 <w:color w:val="050066"/>
-                <w:sz w:val="20"/>
-                <w:szCs w:val="20"/>
+                <w:sz w:val="24"/>
+                <w:szCs w:val="24"/>
               </w:rPr>
               <w:t xml:space="preserve"/>
             </w:r>
@@ -554,13 +554,13 @@
       <w:tr>
         <w:tc>
           <w:tcPr>
-            <w:tcW w:type="pct" w:w="2300"/>
+            <w:tcW w:type="pct" w:w="2400"/>
             <w:shd w:fill="F6F6F6" w:color="auto" w:val="clear"/>
             <w:tcMar>
-              <w:top w:type="dxa" w:w="160"/>
-              <w:left w:type="dxa" w:w="160"/>
-              <w:bottom w:type="dxa" w:w="160"/>
-              <w:right w:type="dxa" w:w="160"/>
+              <w:top w:type="dxa" w:w="220"/>
+              <w:left w:type="dxa" w:w="180"/>
+              <w:bottom w:type="dxa" w:w="200"/>
+              <w:right w:type="dxa" w:w="180"/>
             </w:tcMar>
           </w:tcPr>
           <w:p>
@@ -573,8 +573,8 @@
                 <w:b/>
                 <w:bCs/>
                 <w:color w:val="050066"/>
-                <w:sz w:val="24"/>
-                <w:szCs w:val="24"/>
+                <w:sz w:val="26"/>
+                <w:szCs w:val="26"/>
               </w:rPr>
               <w:t xml:space="preserve">NET SALARY</w:t>
             </w:r>
@@ -582,13 +582,13 @@
         </w:tc>
         <w:tc>
           <w:tcPr>
-            <w:tcW w:type="pct" w:w="1350"/>
+            <w:tcW w:type="pct" w:w="1300"/>
             <w:shd w:fill="F6F6F6" w:color="auto" w:val="clear"/>
             <w:tcMar>
-              <w:top w:type="dxa" w:w="160"/>
-              <w:left w:type="dxa" w:w="160"/>
-              <w:bottom w:type="dxa" w:w="160"/>
-              <w:right w:type="dxa" w:w="160"/>
+              <w:top w:type="dxa" w:w="220"/>
+              <w:left w:type="dxa" w:w="180"/>
+              <w:bottom w:type="dxa" w:w="200"/>
+              <w:right w:type="dxa" w:w="180"/>
             </w:tcMar>
           </w:tcPr>
           <w:p>
@@ -601,8 +601,8 @@
                 <w:b/>
                 <w:bCs/>
                 <w:color w:val="050066"/>
-                <w:sz w:val="24"/>
-                <w:szCs w:val="24"/>
+                <w:sz w:val="26"/>
+                <w:szCs w:val="26"/>
               </w:rPr>
               <w:t xml:space="preserve"/>
             </w:r>
@@ -610,13 +610,13 @@
         </w:tc>
         <w:tc>
           <w:tcPr>
-            <w:tcW w:type="pct" w:w="1350"/>
+            <w:tcW w:type="pct" w:w="1300"/>
             <w:shd w:fill="F6F6F6" w:color="auto" w:val="clear"/>
             <w:tcMar>
-              <w:top w:type="dxa" w:w="160"/>
-              <w:left w:type="dxa" w:w="160"/>
-              <w:bottom w:type="dxa" w:w="160"/>
-              <w:right w:type="dxa" w:w="160"/>
+              <w:top w:type="dxa" w:w="220"/>
+              <w:left w:type="dxa" w:w="180"/>
+              <w:bottom w:type="dxa" w:w="200"/>
+              <w:right w:type="dxa" w:w="180"/>
             </w:tcMar>
           </w:tcPr>
           <w:p>
@@ -629,8 +629,8 @@
                 <w:b/>
                 <w:bCs/>
                 <w:color w:val="050066"/>
-                <w:sz w:val="24"/>
-                <w:szCs w:val="24"/>
+                <w:sz w:val="26"/>
+                <w:szCs w:val="26"/>
               </w:rPr>
               <w:t xml:space="preserve">95,000/-</w:t>
             </w:r>
@@ -640,7 +640,7 @@
     </w:tbl>
     <w:p>
       <w:pPr>
-        <w:spacing w:after="120"/>
+        <w:spacing w:after="140"/>
       </w:pPr>
     </w:p>
     <w:tbl>
@@ -656,7 +656,7 @@
         </w:tblBorders>
       </w:tblPr>
       <w:tblGrid>
-        <w:gridCol w:w="10466"/>
+        <w:gridCol w:w="10826"/>
       </w:tblGrid>
       <w:tr>
         <w:tc>
@@ -664,9 +664,9 @@
             <w:tcW w:type="pct" w:w="5000"/>
             <w:shd w:fill="050066" w:color="auto" w:val="clear"/>
             <w:tcMar>
-              <w:top w:type="dxa" w:w="220"/>
+              <w:top w:type="dxa" w:w="240"/>
               <w:left w:type="dxa" w:w="100"/>
-              <w:bottom w:type="dxa" w:w="220"/>
+              <w:bottom w:type="dxa" w:w="240"/>
               <w:right w:type="dxa" w:w="100"/>
             </w:tcMar>
           </w:tcPr>
@@ -676,7 +676,7 @@
     </w:tbl>
     <w:sectPr>
       <w:pgSz w:w="11906" w:h="16838" w:orient="portrait"/>
-      <w:pgMar w:top="720" w:right="720" w:bottom="720" w:left="720" w:header="708" w:footer="708" w:gutter="0"/>
+      <w:pgMar w:top="720" w:right="540" w:bottom="200" w:left="540" w:header="708" w:footer="708" w:gutter="0"/>
       <w:pgNumType/>
       <w:docGrid w:linePitch="360"/>
     </w:sectPr>

</xml_diff>

<commit_message>
fix(conversion-fidelity & cwf-performance): match iLovePDF typography, table styling, 0.75in margins, footer banner and optimize mobile CWV
</commit_message>
<xml_diff>
--- a/test-fixtures/output-user-salary-slip.docx
+++ b/test-fixtures/output-user-salary-slip.docx
@@ -15,27 +15,30 @@
         </w:tblBorders>
       </w:tblPr>
       <w:tblGrid>
-        <w:gridCol w:w="5196"/>
-        <w:gridCol w:w="5630"/>
+        <w:gridCol w:w="5068"/>
+        <w:gridCol w:w="4678"/>
       </w:tblGrid>
       <w:tr>
         <w:tc>
           <w:tcPr>
-            <w:tcW w:type="pct" w:w="2400"/>
+            <w:tcW w:type="pct" w:w="2600"/>
+            <w:tcMar>
+              <w:top w:type="dxa" w:w="120"/>
+              <w:left w:type="dxa" w:w="0"/>
+              <w:bottom w:type="dxa" w:w="120"/>
+              <w:right w:type="dxa" w:w="120"/>
+            </w:tcMar>
             <w:vAlign w:val="center"/>
           </w:tcPr>
           <w:p>
-            <w:pPr>
-              <w:spacing w:after="100" w:before="100"/>
-            </w:pPr>
             <w:r>
               <w:rPr>
                 <w:rFonts w:ascii="Poppins" w:cs="Poppins" w:eastAsia="Poppins" w:hAnsi="Poppins"/>
                 <w:b/>
                 <w:bCs/>
                 <w:color w:val="050066"/>
-                <w:sz w:val="54"/>
-                <w:szCs w:val="54"/>
+                <w:sz w:val="46"/>
+                <w:szCs w:val="46"/>
               </w:rPr>
               <w:t xml:space="preserve">Salary Slip</w:t>
             </w:r>
@@ -43,42 +46,45 @@
         </w:tc>
         <w:tc>
           <w:tcPr>
-            <w:tcW w:type="pct" w:w="2600"/>
+            <w:tcW w:type="pct" w:w="2400"/>
             <w:shd w:fill="050066" w:color="auto" w:val="clear"/>
             <w:tcMar>
-              <w:top w:type="dxa" w:w="200"/>
+              <w:top w:type="dxa" w:w="220"/>
               <w:left w:type="dxa" w:w="240"/>
-              <w:bottom w:type="dxa" w:w="200"/>
+              <w:bottom w:type="dxa" w:w="220"/>
               <w:right w:type="dxa" w:w="240"/>
             </w:tcMar>
             <w:vAlign w:val="center"/>
           </w:tcPr>
           <w:p>
             <w:pPr>
-              <w:spacing w:after="40" w:before="40"/>
+              <w:spacing w:after="40"/>
               <w:jc w:val="center"/>
             </w:pPr>
             <w:r>
               <w:rPr>
-                <w:rFonts w:ascii="Bevan" w:cs="Bevan" w:eastAsia="Bevan" w:hAnsi="Bevan"/>
+                <w:rFonts w:ascii="Georgia" w:cs="Georgia" w:eastAsia="Georgia" w:hAnsi="Georgia"/>
+                <w:b/>
+                <w:bCs/>
                 <w:color w:val="FFFFFF"/>
-                <w:sz w:val="68"/>
-                <w:szCs w:val="68"/>
+                <w:sz w:val="44"/>
+                <w:szCs w:val="44"/>
               </w:rPr>
               <w:t xml:space="preserve">E-Solar</w:t>
             </w:r>
           </w:p>
           <w:p>
             <w:pPr>
-              <w:spacing w:after="40" w:before="0"/>
               <w:jc w:val="center"/>
             </w:pPr>
             <w:r>
               <w:rPr>
-                <w:rFonts w:ascii="Bevan" w:cs="Bevan" w:eastAsia="Bevan" w:hAnsi="Bevan"/>
+                <w:rFonts w:ascii="Georgia" w:cs="Georgia" w:eastAsia="Georgia" w:hAnsi="Georgia"/>
+                <w:b w:val="false"/>
+                <w:bCs w:val="false"/>
                 <w:color w:val="FFFFFF"/>
-                <w:sz w:val="48"/>
-                <w:szCs w:val="48"/>
+                <w:sz w:val="32"/>
+                <w:szCs w:val="32"/>
               </w:rPr>
               <w:t xml:space="preserve">Energies</w:t>
             </w:r>
@@ -88,12 +94,12 @@
     </w:tbl>
     <w:p>
       <w:pPr>
-        <w:spacing w:after="180" w:before="180"/>
+        <w:spacing w:after="120" w:before="200"/>
       </w:pPr>
     </w:p>
     <w:p>
       <w:pPr>
-        <w:spacing w:after="30" w:before="30" w:line="260"/>
+        <w:spacing w:after="30" w:before="20" w:line="260"/>
       </w:pPr>
       <w:r>
         <w:rPr>
@@ -101,8 +107,8 @@
           <w:b/>
           <w:bCs/>
           <w:color w:val="050066"/>
-          <w:sz w:val="24"/>
-          <w:szCs w:val="24"/>
+          <w:sz w:val="22"/>
+          <w:szCs w:val="22"/>
         </w:rPr>
         <w:t xml:space="preserve">Employee Name: </w:t>
       </w:r>
@@ -112,15 +118,15 @@
           <w:b w:val="false"/>
           <w:bCs w:val="false"/>
           <w:color w:val="050066"/>
-          <w:sz w:val="24"/>
-          <w:szCs w:val="24"/>
+          <w:sz w:val="22"/>
+          <w:szCs w:val="22"/>
         </w:rPr>
         <w:t xml:space="preserve">Hamza Alloudin</w:t>
       </w:r>
     </w:p>
     <w:p>
       <w:pPr>
-        <w:spacing w:after="30" w:before="30" w:line="260"/>
+        <w:spacing w:after="30" w:before="20" w:line="260"/>
       </w:pPr>
       <w:r>
         <w:rPr>
@@ -128,8 +134,8 @@
           <w:b/>
           <w:bCs/>
           <w:color w:val="050066"/>
-          <w:sz w:val="24"/>
-          <w:szCs w:val="24"/>
+          <w:sz w:val="22"/>
+          <w:szCs w:val="22"/>
         </w:rPr>
         <w:t xml:space="preserve">Department: </w:t>
       </w:r>
@@ -139,15 +145,15 @@
           <w:b w:val="false"/>
           <w:bCs w:val="false"/>
           <w:color w:val="050066"/>
-          <w:sz w:val="24"/>
-          <w:szCs w:val="24"/>
+          <w:sz w:val="22"/>
+          <w:szCs w:val="22"/>
         </w:rPr>
         <w:t xml:space="preserve">Sales and Marketing</w:t>
       </w:r>
     </w:p>
     <w:p>
       <w:pPr>
-        <w:spacing w:after="30" w:before="30" w:line="260"/>
+        <w:spacing w:after="30" w:before="20" w:line="260"/>
       </w:pPr>
       <w:r>
         <w:rPr>
@@ -155,8 +161,8 @@
           <w:b/>
           <w:bCs/>
           <w:color w:val="050066"/>
-          <w:sz w:val="24"/>
-          <w:szCs w:val="24"/>
+          <w:sz w:val="22"/>
+          <w:szCs w:val="22"/>
         </w:rPr>
         <w:t xml:space="preserve">Designation: </w:t>
       </w:r>
@@ -166,24 +172,26 @@
           <w:b w:val="false"/>
           <w:bCs w:val="false"/>
           <w:color w:val="050066"/>
-          <w:sz w:val="24"/>
-          <w:szCs w:val="24"/>
-        </w:rPr>
-        <w:t xml:space="preserve">Sales Manager</w:t>
-      </w:r>
-    </w:p>
-    <w:p>
-      <w:pPr>
-        <w:spacing w:after="80" w:before="240"/>
-      </w:pPr>
-      <w:r>
-        <w:rPr>
-          <w:rFonts w:ascii="Poppins" w:cs="Poppins" w:eastAsia="Poppins" w:hAnsi="Poppins"/>
-          <w:color w:val="050066"/>
           <w:sz w:val="22"/>
           <w:szCs w:val="22"/>
         </w:rPr>
-        <w:t xml:space="preserve">Salary Slip for April, 2025</w:t>
+        <w:t xml:space="preserve">Sales Manager</w:t>
+      </w:r>
+    </w:p>
+    <w:p>
+      <w:pPr>
+        <w:spacing w:after="100" w:before="180"/>
+      </w:pPr>
+      <w:r>
+        <w:rPr>
+          <w:rFonts w:ascii="Poppins" w:cs="Poppins" w:eastAsia="Poppins" w:hAnsi="Poppins"/>
+          <w:b w:val="false"/>
+          <w:bCs w:val="false"/>
+          <w:color w:val="050066"/>
+          <w:sz w:val="20"/>
+          <w:szCs w:val="20"/>
+        </w:rPr>
+        <w:t xml:space="preserve">Salary Slip for March, 2024</w:t>
       </w:r>
     </w:p>
     <w:tbl>
@@ -199,9 +207,9 @@
         </w:tblBorders>
       </w:tblPr>
       <w:tblGrid>
-        <w:gridCol w:w="5413"/>
-        <w:gridCol w:w="2815"/>
-        <w:gridCol w:w="2598"/>
+        <w:gridCol w:w="4873"/>
+        <w:gridCol w:w="2534"/>
+        <w:gridCol w:w="2339"/>
       </w:tblGrid>
       <w:tr>
         <w:tc>
@@ -209,21 +217,24 @@
             <w:tcW w:type="pct" w:w="2500"/>
             <w:shd w:fill="050066" w:color="auto" w:val="clear"/>
             <w:tcMar>
-              <w:top w:type="dxa" w:w="160"/>
-              <w:left w:type="dxa" w:w="200"/>
-              <w:bottom w:type="dxa" w:w="160"/>
-              <w:right w:type="dxa" w:w="180"/>
-            </w:tcMar>
-          </w:tcPr>
-          <w:p>
-            <w:r>
-              <w:rPr>
-                <w:rFonts w:ascii="Bebas Neue" w:cs="Bebas Neue" w:eastAsia="Bebas Neue" w:hAnsi="Bebas Neue"/>
+              <w:top w:type="dxa" w:w="140"/>
+              <w:left w:type="dxa" w:w="160"/>
+              <w:bottom w:type="dxa" w:w="140"/>
+              <w:right w:type="dxa" w:w="160"/>
+            </w:tcMar>
+          </w:tcPr>
+          <w:p>
+            <w:pPr>
+              <w:jc w:val="left"/>
+            </w:pPr>
+            <w:r>
+              <w:rPr>
+                <w:rFonts w:ascii="Poppins" w:cs="Poppins" w:eastAsia="Poppins" w:hAnsi="Poppins"/>
                 <w:b/>
                 <w:bCs/>
                 <w:color w:val="FFFFFF"/>
-                <w:sz w:val="34"/>
-                <w:szCs w:val="34"/>
+                <w:sz w:val="24"/>
+                <w:szCs w:val="24"/>
               </w:rPr>
               <w:t xml:space="preserve">EARNINGS</w:t>
             </w:r>
@@ -234,21 +245,24 @@
             <w:tcW w:type="pct" w:w="1300"/>
             <w:shd w:fill="050066" w:color="auto" w:val="clear"/>
             <w:tcMar>
-              <w:top w:type="dxa" w:w="160"/>
-              <w:left w:type="dxa" w:w="180"/>
-              <w:bottom w:type="dxa" w:w="160"/>
-              <w:right w:type="dxa" w:w="180"/>
-            </w:tcMar>
-          </w:tcPr>
-          <w:p>
-            <w:r>
-              <w:rPr>
-                <w:rFonts w:ascii="Bebas Neue" w:cs="Bebas Neue" w:eastAsia="Bebas Neue" w:hAnsi="Bebas Neue"/>
+              <w:top w:type="dxa" w:w="140"/>
+              <w:left w:type="dxa" w:w="160"/>
+              <w:bottom w:type="dxa" w:w="140"/>
+              <w:right w:type="dxa" w:w="160"/>
+            </w:tcMar>
+          </w:tcPr>
+          <w:p>
+            <w:pPr>
+              <w:jc w:val="left"/>
+            </w:pPr>
+            <w:r>
+              <w:rPr>
+                <w:rFonts w:ascii="Poppins" w:cs="Poppins" w:eastAsia="Poppins" w:hAnsi="Poppins"/>
                 <w:b/>
                 <w:bCs/>
                 <w:color w:val="FFFFFF"/>
-                <w:sz w:val="34"/>
-                <w:szCs w:val="34"/>
+                <w:sz w:val="24"/>
+                <w:szCs w:val="24"/>
               </w:rPr>
               <w:t xml:space="preserve">AMOUNT</w:t>
             </w:r>
@@ -259,10 +273,10 @@
             <w:tcW w:type="pct" w:w="1200"/>
             <w:shd w:fill="050066" w:color="auto" w:val="clear"/>
             <w:tcMar>
-              <w:top w:type="dxa" w:w="160"/>
-              <w:left w:type="dxa" w:w="180"/>
-              <w:bottom w:type="dxa" w:w="160"/>
-              <w:right w:type="dxa" w:w="200"/>
+              <w:top w:type="dxa" w:w="140"/>
+              <w:left w:type="dxa" w:w="160"/>
+              <w:bottom w:type="dxa" w:w="140"/>
+              <w:right w:type="dxa" w:w="160"/>
             </w:tcMar>
           </w:tcPr>
           <w:p>
@@ -271,12 +285,12 @@
             </w:pPr>
             <w:r>
               <w:rPr>
-                <w:rFonts w:ascii="Bebas Neue" w:cs="Bebas Neue" w:eastAsia="Bebas Neue" w:hAnsi="Bebas Neue"/>
+                <w:rFonts w:ascii="Poppins" w:cs="Poppins" w:eastAsia="Poppins" w:hAnsi="Poppins"/>
                 <w:b/>
                 <w:bCs/>
                 <w:color w:val="FFFFFF"/>
-                <w:sz w:val="34"/>
-                <w:szCs w:val="34"/>
+                <w:sz w:val="24"/>
+                <w:szCs w:val="24"/>
               </w:rPr>
               <w:t xml:space="preserve">SUB TOTAL</w:t>
             </w:r>
@@ -287,12 +301,11 @@
         <w:tc>
           <w:tcPr>
             <w:tcW w:type="pct" w:w="2500"/>
-            <w:shd w:fill="F6F6F6" w:color="auto" w:val="clear"/>
-            <w:tcMar>
-              <w:top w:type="dxa" w:w="100"/>
-              <w:left w:type="dxa" w:w="200"/>
-              <w:bottom w:type="dxa" w:w="100"/>
-              <w:right w:type="dxa" w:w="180"/>
+            <w:tcMar>
+              <w:top w:type="dxa" w:w="80"/>
+              <w:left w:type="dxa" w:w="160"/>
+              <w:bottom w:type="dxa" w:w="80"/>
+              <w:right w:type="dxa" w:w="160"/>
             </w:tcMar>
           </w:tcPr>
           <w:p>
@@ -300,8 +313,8 @@
               <w:rPr>
                 <w:rFonts w:ascii="Poppins" w:cs="Poppins" w:eastAsia="Poppins" w:hAnsi="Poppins"/>
                 <w:color w:val="050066"/>
-                <w:sz w:val="23"/>
-                <w:szCs w:val="23"/>
+                <w:sz w:val="22"/>
+                <w:szCs w:val="22"/>
               </w:rPr>
               <w:t xml:space="preserve">Basic Salary</w:t>
             </w:r>
@@ -310,12 +323,11 @@
         <w:tc>
           <w:tcPr>
             <w:tcW w:type="pct" w:w="1300"/>
-            <w:shd w:fill="F6F6F6" w:color="auto" w:val="clear"/>
-            <w:tcMar>
-              <w:top w:type="dxa" w:w="100"/>
-              <w:left w:type="dxa" w:w="180"/>
-              <w:bottom w:type="dxa" w:w="100"/>
-              <w:right w:type="dxa" w:w="180"/>
+            <w:tcMar>
+              <w:top w:type="dxa" w:w="80"/>
+              <w:left w:type="dxa" w:w="160"/>
+              <w:bottom w:type="dxa" w:w="80"/>
+              <w:right w:type="dxa" w:w="160"/>
             </w:tcMar>
           </w:tcPr>
           <w:p>
@@ -323,8 +335,8 @@
               <w:rPr>
                 <w:rFonts w:ascii="Poppins" w:cs="Poppins" w:eastAsia="Poppins" w:hAnsi="Poppins"/>
                 <w:color w:val="050066"/>
-                <w:sz w:val="23"/>
-                <w:szCs w:val="23"/>
+                <w:sz w:val="22"/>
+                <w:szCs w:val="22"/>
               </w:rPr>
               <w:t xml:space="preserve">80,000/-</w:t>
             </w:r>
@@ -333,12 +345,11 @@
         <w:tc>
           <w:tcPr>
             <w:tcW w:type="pct" w:w="1200"/>
-            <w:shd w:fill="F6F6F6" w:color="auto" w:val="clear"/>
-            <w:tcMar>
-              <w:top w:type="dxa" w:w="100"/>
-              <w:left w:type="dxa" w:w="180"/>
-              <w:bottom w:type="dxa" w:w="100"/>
-              <w:right w:type="dxa" w:w="200"/>
+            <w:tcMar>
+              <w:top w:type="dxa" w:w="80"/>
+              <w:left w:type="dxa" w:w="160"/>
+              <w:bottom w:type="dxa" w:w="80"/>
+              <w:right w:type="dxa" w:w="160"/>
             </w:tcMar>
           </w:tcPr>
           <w:p/>
@@ -348,12 +359,11 @@
         <w:tc>
           <w:tcPr>
             <w:tcW w:type="pct" w:w="2500"/>
-            <w:shd w:fill="F6F6F6" w:color="auto" w:val="clear"/>
-            <w:tcMar>
-              <w:top w:type="dxa" w:w="100"/>
-              <w:left w:type="dxa" w:w="200"/>
-              <w:bottom w:type="dxa" w:w="100"/>
-              <w:right w:type="dxa" w:w="180"/>
+            <w:tcMar>
+              <w:top w:type="dxa" w:w="80"/>
+              <w:left w:type="dxa" w:w="160"/>
+              <w:bottom w:type="dxa" w:w="80"/>
+              <w:right w:type="dxa" w:w="160"/>
             </w:tcMar>
           </w:tcPr>
           <w:p>
@@ -361,8 +371,8 @@
               <w:rPr>
                 <w:rFonts w:ascii="Poppins" w:cs="Poppins" w:eastAsia="Poppins" w:hAnsi="Poppins"/>
                 <w:color w:val="050066"/>
-                <w:sz w:val="23"/>
-                <w:szCs w:val="23"/>
+                <w:sz w:val="22"/>
+                <w:szCs w:val="22"/>
               </w:rPr>
               <w:t xml:space="preserve">Overtime</w:t>
             </w:r>
@@ -371,12 +381,11 @@
         <w:tc>
           <w:tcPr>
             <w:tcW w:type="pct" w:w="1300"/>
-            <w:shd w:fill="F6F6F6" w:color="auto" w:val="clear"/>
-            <w:tcMar>
-              <w:top w:type="dxa" w:w="100"/>
-              <w:left w:type="dxa" w:w="180"/>
-              <w:bottom w:type="dxa" w:w="100"/>
-              <w:right w:type="dxa" w:w="180"/>
+            <w:tcMar>
+              <w:top w:type="dxa" w:w="80"/>
+              <w:left w:type="dxa" w:w="160"/>
+              <w:bottom w:type="dxa" w:w="80"/>
+              <w:right w:type="dxa" w:w="160"/>
             </w:tcMar>
           </w:tcPr>
           <w:p>
@@ -384,8 +393,8 @@
               <w:rPr>
                 <w:rFonts w:ascii="Poppins" w:cs="Poppins" w:eastAsia="Poppins" w:hAnsi="Poppins"/>
                 <w:color w:val="050066"/>
-                <w:sz w:val="23"/>
-                <w:szCs w:val="23"/>
+                <w:sz w:val="22"/>
+                <w:szCs w:val="22"/>
               </w:rPr>
               <w:t xml:space="preserve">15,000/-</w:t>
             </w:r>
@@ -394,12 +403,11 @@
         <w:tc>
           <w:tcPr>
             <w:tcW w:type="pct" w:w="1200"/>
-            <w:shd w:fill="F6F6F6" w:color="auto" w:val="clear"/>
-            <w:tcMar>
-              <w:top w:type="dxa" w:w="100"/>
-              <w:left w:type="dxa" w:w="180"/>
-              <w:bottom w:type="dxa" w:w="100"/>
-              <w:right w:type="dxa" w:w="200"/>
+            <w:tcMar>
+              <w:top w:type="dxa" w:w="80"/>
+              <w:left w:type="dxa" w:w="160"/>
+              <w:bottom w:type="dxa" w:w="80"/>
+              <w:right w:type="dxa" w:w="160"/>
             </w:tcMar>
           </w:tcPr>
           <w:p/>
@@ -409,12 +417,11 @@
         <w:tc>
           <w:tcPr>
             <w:tcW w:type="pct" w:w="2500"/>
-            <w:shd w:fill="F6F6F6" w:color="auto" w:val="clear"/>
-            <w:tcMar>
-              <w:top w:type="dxa" w:w="100"/>
-              <w:left w:type="dxa" w:w="200"/>
-              <w:bottom w:type="dxa" w:w="100"/>
-              <w:right w:type="dxa" w:w="180"/>
+            <w:tcMar>
+              <w:top w:type="dxa" w:w="80"/>
+              <w:left w:type="dxa" w:w="160"/>
+              <w:bottom w:type="dxa" w:w="80"/>
+              <w:right w:type="dxa" w:w="160"/>
             </w:tcMar>
           </w:tcPr>
           <w:p>
@@ -422,8 +429,8 @@
               <w:rPr>
                 <w:rFonts w:ascii="Poppins" w:cs="Poppins" w:eastAsia="Poppins" w:hAnsi="Poppins"/>
                 <w:color w:val="050066"/>
-                <w:sz w:val="23"/>
-                <w:szCs w:val="23"/>
+                <w:sz w:val="22"/>
+                <w:szCs w:val="22"/>
               </w:rPr>
               <w:t xml:space="preserve">Gross Salary</w:t>
             </w:r>
@@ -432,12 +439,11 @@
         <w:tc>
           <w:tcPr>
             <w:tcW w:type="pct" w:w="1300"/>
-            <w:shd w:fill="F6F6F6" w:color="auto" w:val="clear"/>
-            <w:tcMar>
-              <w:top w:type="dxa" w:w="100"/>
-              <w:left w:type="dxa" w:w="180"/>
-              <w:bottom w:type="dxa" w:w="100"/>
-              <w:right w:type="dxa" w:w="180"/>
+            <w:tcMar>
+              <w:top w:type="dxa" w:w="80"/>
+              <w:left w:type="dxa" w:w="160"/>
+              <w:bottom w:type="dxa" w:w="80"/>
+              <w:right w:type="dxa" w:w="160"/>
             </w:tcMar>
           </w:tcPr>
           <w:p>
@@ -445,8 +451,8 @@
               <w:rPr>
                 <w:rFonts w:ascii="Poppins" w:cs="Poppins" w:eastAsia="Poppins" w:hAnsi="Poppins"/>
                 <w:color w:val="050066"/>
-                <w:sz w:val="23"/>
-                <w:szCs w:val="23"/>
+                <w:sz w:val="22"/>
+                <w:szCs w:val="22"/>
               </w:rPr>
               <w:t xml:space="preserve">95,000/-</w:t>
             </w:r>
@@ -455,12 +461,11 @@
         <w:tc>
           <w:tcPr>
             <w:tcW w:type="pct" w:w="1200"/>
-            <w:shd w:fill="F6F6F6" w:color="auto" w:val="clear"/>
-            <w:tcMar>
-              <w:top w:type="dxa" w:w="100"/>
-              <w:left w:type="dxa" w:w="180"/>
-              <w:bottom w:type="dxa" w:w="100"/>
-              <w:right w:type="dxa" w:w="200"/>
+            <w:tcMar>
+              <w:top w:type="dxa" w:w="80"/>
+              <w:left w:type="dxa" w:w="160"/>
+              <w:bottom w:type="dxa" w:w="80"/>
+              <w:right w:type="dxa" w:w="160"/>
             </w:tcMar>
           </w:tcPr>
           <w:p/>
@@ -470,23 +475,22 @@
         <w:tc>
           <w:tcPr>
             <w:tcW w:type="pct" w:w="2500"/>
-            <w:shd w:fill="F6F6F6" w:color="auto" w:val="clear"/>
-            <w:tcMar>
-              <w:top w:type="dxa" w:w="280"/>
-              <w:left w:type="dxa" w:w="200"/>
-              <w:bottom w:type="dxa" w:w="240"/>
-              <w:right w:type="dxa" w:w="180"/>
-            </w:tcMar>
-          </w:tcPr>
-          <w:p>
-            <w:r>
-              <w:rPr>
-                <w:rFonts w:ascii="Bebas Neue" w:cs="Bebas Neue" w:eastAsia="Bebas Neue" w:hAnsi="Bebas Neue"/>
+            <w:tcMar>
+              <w:top w:type="dxa" w:w="220"/>
+              <w:left w:type="dxa" w:w="160"/>
+              <w:bottom w:type="dxa" w:w="180"/>
+              <w:right w:type="dxa" w:w="160"/>
+            </w:tcMar>
+          </w:tcPr>
+          <w:p>
+            <w:r>
+              <w:rPr>
+                <w:rFonts w:ascii="Poppins" w:cs="Poppins" w:eastAsia="Poppins" w:hAnsi="Poppins"/>
                 <w:b/>
                 <w:bCs/>
                 <w:color w:val="050066"/>
-                <w:sz w:val="34"/>
-                <w:szCs w:val="34"/>
+                <w:sz w:val="26"/>
+                <w:szCs w:val="26"/>
               </w:rPr>
               <w:t xml:space="preserve">NET SALARY</w:t>
             </w:r>
@@ -495,12 +499,11 @@
         <w:tc>
           <w:tcPr>
             <w:tcW w:type="pct" w:w="1300"/>
-            <w:shd w:fill="F6F6F6" w:color="auto" w:val="clear"/>
-            <w:tcMar>
-              <w:top w:type="dxa" w:w="280"/>
-              <w:left w:type="dxa" w:w="180"/>
-              <w:bottom w:type="dxa" w:w="240"/>
-              <w:right w:type="dxa" w:w="180"/>
+            <w:tcMar>
+              <w:top w:type="dxa" w:w="220"/>
+              <w:left w:type="dxa" w:w="160"/>
+              <w:bottom w:type="dxa" w:w="180"/>
+              <w:right w:type="dxa" w:w="160"/>
             </w:tcMar>
           </w:tcPr>
           <w:p/>
@@ -508,12 +511,11 @@
         <w:tc>
           <w:tcPr>
             <w:tcW w:type="pct" w:w="1200"/>
-            <w:shd w:fill="F6F6F6" w:color="auto" w:val="clear"/>
-            <w:tcMar>
-              <w:top w:type="dxa" w:w="280"/>
-              <w:left w:type="dxa" w:w="180"/>
-              <w:bottom w:type="dxa" w:w="240"/>
-              <w:right w:type="dxa" w:w="200"/>
+            <w:tcMar>
+              <w:top w:type="dxa" w:w="220"/>
+              <w:left w:type="dxa" w:w="160"/>
+              <w:bottom w:type="dxa" w:w="180"/>
+              <w:right w:type="dxa" w:w="160"/>
             </w:tcMar>
           </w:tcPr>
           <w:p>
@@ -522,58 +524,23 @@
             </w:pPr>
             <w:r>
               <w:rPr>
-                <w:rFonts w:ascii="Bebas Neue" w:cs="Bebas Neue" w:eastAsia="Bebas Neue" w:hAnsi="Bebas Neue"/>
+                <w:rFonts w:ascii="Poppins" w:cs="Poppins" w:eastAsia="Poppins" w:hAnsi="Poppins"/>
                 <w:b/>
                 <w:bCs/>
                 <w:color w:val="050066"/>
-                <w:sz w:val="34"/>
-                <w:szCs w:val="34"/>
+                <w:sz w:val="26"/>
+                <w:szCs w:val="26"/>
               </w:rPr>
               <w:t xml:space="preserve">95,000/-</w:t>
             </w:r>
           </w:p>
-        </w:tc>
-      </w:tr>
-    </w:tbl>
-    <w:p>
-      <w:pPr>
-        <w:spacing w:after="320" w:before="320"/>
-      </w:pPr>
-    </w:p>
-    <w:tbl>
-      <w:tblPr>
-        <w:tblW w:type="pct" w:w="5000"/>
-        <w:tblBorders>
-          <w:top w:val="none"/>
-          <w:left w:val="none"/>
-          <w:bottom w:val="none"/>
-          <w:right w:val="none"/>
-          <w:insideH w:val="none"/>
-          <w:insideV w:val="none"/>
-        </w:tblBorders>
-      </w:tblPr>
-      <w:tblGrid>
-        <w:gridCol w:w="10826"/>
-      </w:tblGrid>
-      <w:tr>
-        <w:tc>
-          <w:tcPr>
-            <w:tcW w:type="pct" w:w="5000"/>
-            <w:shd w:fill="050066" w:color="auto" w:val="clear"/>
-            <w:tcMar>
-              <w:top w:type="dxa" w:w="300"/>
-              <w:left w:type="dxa" w:w="100"/>
-              <w:bottom w:type="dxa" w:w="300"/>
-              <w:right w:type="dxa" w:w="100"/>
-            </w:tcMar>
-          </w:tcPr>
-          <w:p/>
         </w:tc>
       </w:tr>
     </w:tbl>
     <w:sectPr>
+      <w:footerReference w:type="default" r:id="rId6"/>
       <w:pgSz w:w="11906" w:h="16838" w:orient="portrait"/>
-      <w:pgMar w:top="540" w:right="540" w:bottom="200" w:left="540" w:header="708" w:footer="708" w:gutter="0"/>
+      <w:pgMar w:top="720" w:right="1080" w:bottom="500" w:left="1080" w:header="708" w:footer="708" w:gutter="0"/>
       <w:pgNumType/>
       <w:docGrid w:linePitch="360"/>
     </w:sectPr>
@@ -616,6 +583,42 @@
     </w:p>
   </w:endnote>
 </w:endnotes>
+</file>
+
+<file path=word/footer1.xml><?xml version="1.0" encoding="utf-8"?>
+<w:ftr xmlns:wpc="http://schemas.microsoft.com/office/word/2010/wordprocessingCanvas" xmlns:mc="http://schemas.openxmlformats.org/markup-compatibility/2006" xmlns:o="urn:schemas-microsoft-com:office:office" xmlns:r="http://schemas.openxmlformats.org/officeDocument/2006/relationships" xmlns:m="http://schemas.openxmlformats.org/officeDocument/2006/math" xmlns:v="urn:schemas-microsoft-com:vml" xmlns:wp14="http://schemas.microsoft.com/office/word/2010/wordprocessingDrawing" xmlns:wp="http://schemas.openxmlformats.org/drawingml/2006/wordprocessingDrawing" xmlns:w10="urn:schemas-microsoft-com:office:word" xmlns:w="http://schemas.openxmlformats.org/wordprocessingml/2006/main" xmlns:w14="http://schemas.microsoft.com/office/word/2010/wordml" xmlns:w15="http://schemas.microsoft.com/office/word/2012/wordml" xmlns:wpg="http://schemas.microsoft.com/office/word/2010/wordprocessingGroup" xmlns:wpi="http://schemas.microsoft.com/office/word/2010/wordprocessingInk" xmlns:wne="http://schemas.microsoft.com/office/word/2006/wordml" xmlns:wps="http://schemas.microsoft.com/office/word/2010/wordprocessingShape">
+  <w:tbl>
+    <w:tblPr>
+      <w:tblW w:type="pct" w:w="5000"/>
+      <w:tblBorders>
+        <w:top w:val="none"/>
+        <w:left w:val="none"/>
+        <w:bottom w:val="none"/>
+        <w:right w:val="none"/>
+        <w:insideH w:val="none"/>
+        <w:insideV w:val="none"/>
+      </w:tblBorders>
+    </w:tblPr>
+    <w:tblGrid>
+      <w:gridCol w:w="9746"/>
+    </w:tblGrid>
+    <w:tr>
+      <w:tc>
+        <w:tcPr>
+          <w:tcW w:type="pct" w:w="5000"/>
+          <w:shd w:fill="050066" w:color="auto" w:val="clear"/>
+          <w:tcMar>
+            <w:top w:type="dxa" w:w="240"/>
+            <w:left w:type="dxa" w:w="0"/>
+            <w:bottom w:type="dxa" w:w="240"/>
+            <w:right w:type="dxa" w:w="0"/>
+          </w:tcMar>
+        </w:tcPr>
+        <w:p/>
+      </w:tc>
+    </w:tr>
+  </w:tbl>
+</w:ftr>
 </file>
 
 <file path=word/footnotes.xml><?xml version="1.0" encoding="utf-8"?>

</xml_diff>